<commit_message>
Pipeline outputs (in-progress run)
Co-Authored-By: Claude Opus 5.5 <noreply@anthropic.com>
Claude-Session: https://claude.ai/code/session_01TDKUQHsCDyCgHcauCnDNRk
</commit_message>
<xml_diff>
--- a/ESG_Text_Based_Incentives/Documentation/Reports/01_Quality_Audit_Report.docx
+++ b/ESG_Text_Based_Incentives/Documentation/Reports/01_Quality_Audit_Report.docx
@@ -228,7 +228,7 @@
                 <w:sz w:val="17"/>
                 <w:szCs w:val="17"/>
               </w:rPr>
-              <w:t xml:space="preserve">2026-10-31 16:56</w:t>
+              <w:t xml:space="preserve">2026-10-31 20:55</w:t>
             </w:r>
           </w:p>
         </w:tc>
@@ -288,7 +288,7 @@
                 <w:sz w:val="17"/>
                 <w:szCs w:val="17"/>
               </w:rPr>
-              <w:t xml:space="preserve">dd6c450</w:t>
+              <w:t xml:space="preserve">badbbbd</w:t>
             </w:r>
           </w:p>
         </w:tc>
@@ -443,13 +443,13 @@
           <w:b/>
           <w:bCs/>
         </w:rPr>
-        <w:t xml:space="preserve">93</w:t>
+        <w:t xml:space="preserve">95</w:t>
       </w:r>
       <w:r>
         <w:rPr>
           <w:rFonts w:ascii="Calibri" w:cs="Calibri" w:eastAsia="Microsoft YaHei" w:hAnsi="Calibri"/>
         </w:rPr>
-        <w:t xml:space="preserve"> 项检查：PASS 77，FAIL 0，WARN 2，INFO 14。关键逻辑（Grant ESG、各层计数、采用指标、E/S/G 采用、lb 占比、同一文本标签一致性、text_id 哈希）均从下层数据重新推导后与成品比对，而非直接复用构建步骤的结果。</w:t>
+        <w:t xml:space="preserve"> 项检查：PASS 79，FAIL 0，WARN 2，INFO 14。关键逻辑（Grant ESG、各层计数、采用指标、E/S/G 采用、lb 占比、同一文本标签一致性、text_id 哈希）均从下层数据重新推导后与成品比对，而非直接复用构建步骤的结果。</w:t>
       </w:r>
     </w:p>
     <w:p>
@@ -1299,7 +1299,7 @@
                 <w:sz w:val="16"/>
                 <w:szCs w:val="16"/>
               </w:rPr>
-              <w:t xml:space="preserve">76</w:t>
+              <w:t xml:space="preserve">82</w:t>
             </w:r>
           </w:p>
         </w:tc>
@@ -4340,7 +4340,7 @@
                 <w:sz w:val="15"/>
                 <w:szCs w:val="15"/>
               </w:rPr>
-              <w:t xml:space="preserve">status consistent (unknown &lt;=&gt; strict missing; confirmed &lt;=&gt; human_reviewed)</w:t>
+              <w:t xml:space="preserve">status consistent (unknown/confirmed_unknown &lt;=&gt; strict missing; confirmed* &lt;=&gt; human_reviewed)</w:t>
             </w:r>
           </w:p>
         </w:tc>
@@ -9151,7 +9151,7 @@
                 <w:sz w:val="15"/>
                 <w:szCs w:val="15"/>
               </w:rPr>
-              <w:t xml:space="preserve">esg + non-esg + unknown KPIs = n_kpis</w:t>
+              <w:t xml:space="preserve">grant_esg_extended_only follows three-state rule</w:t>
             </w:r>
           </w:p>
         </w:tc>
@@ -9287,7 +9287,7 @@
                 <w:sz w:val="15"/>
                 <w:szCs w:val="15"/>
               </w:rPr>
-              <w:t xml:space="preserve">time grants without perf condition have no KPIs</w:t>
+              <w:t xml:space="preserve">grant E/S/G KPI shares: exact only if every pillar known; lb/ub re-derived from KPI master</w:t>
             </w:r>
           </w:p>
         </w:tc>
@@ -9423,7 +9423,7 @@
                 <w:sz w:val="15"/>
                 <w:szCs w:val="15"/>
               </w:rPr>
-              <w:t xml:space="preserve">duplicated grantIDs: resolved type consistent with goal files</w:t>
+              <w:t xml:space="preserve">esg + non-esg + unknown KPIs = n_kpis</w:t>
             </w:r>
           </w:p>
         </w:tc>
@@ -9452,7 +9452,7 @@
                 <w:sz w:val="15"/>
                 <w:szCs w:val="15"/>
               </w:rPr>
-              <w:t xml:space="preserve">INFO</w:t>
+              <w:t xml:space="preserve">PASS</w:t>
             </w:r>
           </w:p>
         </w:tc>
@@ -9472,18 +9472,7 @@
               <w:right w:type="dxa" w:w="80"/>
             </w:tcMar>
           </w:tcPr>
-          <w:p>
-            <w:r>
-              <w:rPr>
-                <w:rFonts w:ascii="Calibri" w:cs="Calibri" w:eastAsia="Microsoft YaHei" w:hAnsi="Calibri"/>
-                <w:b w:val="false"/>
-                <w:bCs w:val="false"/>
-                <w:sz w:val="15"/>
-                <w:szCs w:val="15"/>
-              </w:rPr>
-              <w:t xml:space="preserve">141</w:t>
-            </w:r>
-          </w:p>
+          <w:p/>
         </w:tc>
       </w:tr>
       <w:tr>
@@ -9570,7 +9559,7 @@
                 <w:sz w:val="15"/>
                 <w:szCs w:val="15"/>
               </w:rPr>
-              <w:t xml:space="preserve">grants with incomplete goal data are never classified 0</w:t>
+              <w:t xml:space="preserve">time grants without perf condition have no KPIs</w:t>
             </w:r>
           </w:p>
         </w:tc>
@@ -9619,18 +9608,7 @@
               <w:right w:type="dxa" w:w="80"/>
             </w:tcMar>
           </w:tcPr>
-          <w:p>
-            <w:r>
-              <w:rPr>
-                <w:rFonts w:ascii="Calibri" w:cs="Calibri" w:eastAsia="Microsoft YaHei" w:hAnsi="Calibri"/>
-                <w:b w:val="false"/>
-                <w:bCs w:val="false"/>
-                <w:sz w:val="15"/>
-                <w:szCs w:val="15"/>
-              </w:rPr>
-              <w:t xml:space="preserve">335</w:t>
-            </w:r>
-          </w:p>
+          <w:p/>
         </w:tc>
       </w:tr>
       <w:tr>
@@ -9717,7 +9695,7 @@
                 <w:sz w:val="15"/>
                 <w:szCs w:val="15"/>
               </w:rPr>
-              <w:t xml:space="preserve">grant_value_combined = fair value, else non-equity target; source flag consistent</w:t>
+              <w:t xml:space="preserve">duplicated grantIDs: resolved type consistent with goal files</w:t>
             </w:r>
           </w:p>
         </w:tc>
@@ -9746,7 +9724,7 @@
                 <w:sz w:val="15"/>
                 <w:szCs w:val="15"/>
               </w:rPr>
-              <w:t xml:space="preserve">PASS</w:t>
+              <w:t xml:space="preserve">INFO</w:t>
             </w:r>
           </w:p>
         </w:tc>
@@ -9766,7 +9744,18 @@
               <w:right w:type="dxa" w:w="80"/>
             </w:tcMar>
           </w:tcPr>
-          <w:p/>
+          <w:p>
+            <w:r>
+              <w:rPr>
+                <w:rFonts w:ascii="Calibri" w:cs="Calibri" w:eastAsia="Microsoft YaHei" w:hAnsi="Calibri"/>
+                <w:b w:val="false"/>
+                <w:bCs w:val="false"/>
+                <w:sz w:val="15"/>
+                <w:szCs w:val="15"/>
+              </w:rPr>
+              <w:t xml:space="preserve">141</w:t>
+            </w:r>
+          </w:p>
         </w:tc>
       </w:tr>
       <w:tr>
@@ -9853,7 +9842,7 @@
                 <w:sz w:val="15"/>
                 <w:szCs w:val="15"/>
               </w:rPr>
-              <w:t xml:space="preserve">value source distribution</w:t>
+              <w:t xml:space="preserve">grants with incomplete goal data are never classified 0</w:t>
             </w:r>
           </w:p>
         </w:tc>
@@ -9882,7 +9871,7 @@
                 <w:sz w:val="15"/>
                 <w:szCs w:val="15"/>
               </w:rPr>
-              <w:t xml:space="preserve">INFO</w:t>
+              <w:t xml:space="preserve">PASS</w:t>
             </w:r>
           </w:p>
         </w:tc>
@@ -9911,7 +9900,7 @@
                 <w:sz w:val="15"/>
                 <w:szCs w:val="15"/>
               </w:rPr>
-              <w:t xml:space="preserve">{'grant_date_fair_value': 278382, 'nonequity_target_payout': 106524, 'missing': 84523}</w:t>
+              <w:t xml:space="preserve">335</w:t>
             </w:r>
           </w:p>
         </w:tc>
@@ -10000,7 +9989,7 @@
                 <w:sz w:val="15"/>
                 <w:szCs w:val="15"/>
               </w:rPr>
-              <w:t xml:space="preserve">perf grants with missing goal data (Unknown, not 0)</w:t>
+              <w:t xml:space="preserve">grant_value_combined = fair value, else non-equity target; source flag consistent</w:t>
             </w:r>
           </w:p>
         </w:tc>
@@ -10049,18 +10038,7 @@
               <w:right w:type="dxa" w:w="80"/>
             </w:tcMar>
           </w:tcPr>
-          <w:p>
-            <w:r>
-              <w:rPr>
-                <w:rFonts w:ascii="Calibri" w:cs="Calibri" w:eastAsia="Microsoft YaHei" w:hAnsi="Calibri"/>
-                <w:b w:val="false"/>
-                <w:bCs w:val="false"/>
-                <w:sz w:val="15"/>
-                <w:szCs w:val="15"/>
-              </w:rPr>
-              <w:t xml:space="preserve">159</w:t>
-            </w:r>
-          </w:p>
+          <w:p/>
         </w:tc>
       </w:tr>
       <w:tr>
@@ -10147,7 +10125,7 @@
                 <w:sz w:val="15"/>
                 <w:szCs w:val="15"/>
               </w:rPr>
-              <w:t xml:space="preserve">all 10 share/coverage variables within [0,1]</w:t>
+              <w:t xml:space="preserve">value source distribution</w:t>
             </w:r>
           </w:p>
         </w:tc>
@@ -10176,7 +10154,7 @@
                 <w:sz w:val="15"/>
                 <w:szCs w:val="15"/>
               </w:rPr>
-              <w:t xml:space="preserve">PASS</w:t>
+              <w:t xml:space="preserve">INFO</w:t>
             </w:r>
           </w:p>
         </w:tc>
@@ -10205,7 +10183,7 @@
                 <w:sz w:val="15"/>
                 <w:szCs w:val="15"/>
               </w:rPr>
-              <w:t xml:space="preserve">0</w:t>
+              <w:t xml:space="preserve">{'grant_date_fair_value': 278382, 'nonequity_target_payout': 106524, 'missing': 84523}</w:t>
             </w:r>
           </w:p>
         </w:tc>
@@ -10294,7 +10272,7 @@
                 <w:sz w:val="15"/>
                 <w:szCs w:val="15"/>
               </w:rPr>
-              <w:t xml:space="preserve">lower bound &lt;= upper bound (2 pairs)</w:t>
+              <w:t xml:space="preserve">perf grants with missing goal data (Unknown, not 0)</w:t>
             </w:r>
           </w:p>
         </w:tc>
@@ -10352,7 +10330,7 @@
                 <w:sz w:val="15"/>
                 <w:szCs w:val="15"/>
               </w:rPr>
-              <w:t xml:space="preserve">0</w:t>
+              <w:t xml:space="preserve">159</w:t>
             </w:r>
           </w:p>
         </w:tc>
@@ -10412,7 +10390,7 @@
                 <w:sz w:val="15"/>
                 <w:szCs w:val="15"/>
               </w:rPr>
-              <w:t xml:space="preserve">D</w:t>
+              <w:t xml:space="preserve">C</w:t>
             </w:r>
           </w:p>
         </w:tc>
@@ -10441,7 +10419,7 @@
                 <w:sz w:val="15"/>
                 <w:szCs w:val="15"/>
               </w:rPr>
-              <w:t xml:space="preserve">primary key (cik, fiscalyear, participantid) unique</w:t>
+              <w:t xml:space="preserve">all 16 share/coverage variables within [0,1]</w:t>
             </w:r>
           </w:p>
         </w:tc>
@@ -10499,7 +10477,7 @@
                 <w:sz w:val="15"/>
                 <w:szCs w:val="15"/>
               </w:rPr>
-              <w:t xml:space="preserve">164832</w:t>
+              <w:t xml:space="preserve">0</w:t>
             </w:r>
           </w:p>
         </w:tc>
@@ -10559,7 +10537,7 @@
                 <w:sz w:val="15"/>
                 <w:szCs w:val="15"/>
               </w:rPr>
-              <w:t xml:space="preserve">D</w:t>
+              <w:t xml:space="preserve">C</w:t>
             </w:r>
           </w:p>
         </w:tc>
@@ -10588,7 +10566,7 @@
                 <w:sz w:val="15"/>
                 <w:szCs w:val="15"/>
               </w:rPr>
-              <w:t xml:space="preserve">sum exec_n_grants = grants</w:t>
+              <w:t xml:space="preserve">lower bound &lt;= upper bound (5 pairs)</w:t>
             </w:r>
           </w:p>
         </w:tc>
@@ -10646,7 +10624,7 @@
                 <w:sz w:val="15"/>
                 <w:szCs w:val="15"/>
               </w:rPr>
-              <w:t xml:space="preserve">469,429</w:t>
+              <w:t xml:space="preserve">0</w:t>
             </w:r>
           </w:p>
         </w:tc>
@@ -10735,7 +10713,7 @@
                 <w:sz w:val="15"/>
                 <w:szCs w:val="15"/>
               </w:rPr>
-              <w:t xml:space="preserve">exec grant / ESG-grant counts re-derived from grant master</w:t>
+              <w:t xml:space="preserve">primary key (cik, fiscalyear, participantid) unique</w:t>
             </w:r>
           </w:p>
         </w:tc>
@@ -10784,7 +10762,18 @@
               <w:right w:type="dxa" w:w="80"/>
             </w:tcMar>
           </w:tcPr>
-          <w:p/>
+          <w:p>
+            <w:r>
+              <w:rPr>
+                <w:rFonts w:ascii="Calibri" w:cs="Calibri" w:eastAsia="Microsoft YaHei" w:hAnsi="Calibri"/>
+                <w:b w:val="false"/>
+                <w:bCs w:val="false"/>
+                <w:sz w:val="15"/>
+                <w:szCs w:val="15"/>
+              </w:rPr>
+              <w:t xml:space="preserve">164832</w:t>
+            </w:r>
+          </w:p>
         </w:tc>
       </w:tr>
       <w:tr>
@@ -10871,7 +10860,7 @@
                 <w:sz w:val="15"/>
                 <w:szCs w:val="15"/>
               </w:rPr>
-              <w:t xml:space="preserve">adoption=1 iff &gt;=1 ESG grant</w:t>
+              <w:t xml:space="preserve">sum exec_n_grants = grants</w:t>
             </w:r>
           </w:p>
         </w:tc>
@@ -10920,7 +10909,18 @@
               <w:right w:type="dxa" w:w="80"/>
             </w:tcMar>
           </w:tcPr>
-          <w:p/>
+          <w:p>
+            <w:r>
+              <w:rPr>
+                <w:rFonts w:ascii="Calibri" w:cs="Calibri" w:eastAsia="Microsoft YaHei" w:hAnsi="Calibri"/>
+                <w:b w:val="false"/>
+                <w:bCs w:val="false"/>
+                <w:sz w:val="15"/>
+                <w:szCs w:val="15"/>
+              </w:rPr>
+              <w:t xml:space="preserve">469,429</w:t>
+            </w:r>
+          </w:p>
         </w:tc>
       </w:tr>
       <w:tr>
@@ -11007,7 +11007,7 @@
                 <w:sz w:val="15"/>
                 <w:szCs w:val="15"/>
               </w:rPr>
-              <w:t xml:space="preserve">all 47 share/coverage variables within [0,1]</w:t>
+              <w:t xml:space="preserve">exec grant / ESG-grant counts re-derived from grant master</w:t>
             </w:r>
           </w:p>
         </w:tc>
@@ -11056,18 +11056,7 @@
               <w:right w:type="dxa" w:w="80"/>
             </w:tcMar>
           </w:tcPr>
-          <w:p>
-            <w:r>
-              <w:rPr>
-                <w:rFonts w:ascii="Calibri" w:cs="Calibri" w:eastAsia="Microsoft YaHei" w:hAnsi="Calibri"/>
-                <w:b w:val="false"/>
-                <w:bCs w:val="false"/>
-                <w:sz w:val="15"/>
-                <w:szCs w:val="15"/>
-              </w:rPr>
-              <w:t xml:space="preserve">0</w:t>
-            </w:r>
-          </w:p>
+          <w:p/>
         </w:tc>
       </w:tr>
       <w:tr>
@@ -11154,7 +11143,7 @@
                 <w:sz w:val="15"/>
                 <w:szCs w:val="15"/>
               </w:rPr>
-              <w:t xml:space="preserve">lower bound &lt;= upper bound (14 pairs)</w:t>
+              <w:t xml:space="preserve">adoption=1 iff &gt;=1 ESG grant</w:t>
             </w:r>
           </w:p>
         </w:tc>
@@ -11203,18 +11192,7 @@
               <w:right w:type="dxa" w:w="80"/>
             </w:tcMar>
           </w:tcPr>
-          <w:p>
-            <w:r>
-              <w:rPr>
-                <w:rFonts w:ascii="Calibri" w:cs="Calibri" w:eastAsia="Microsoft YaHei" w:hAnsi="Calibri"/>
-                <w:b w:val="false"/>
-                <w:bCs w:val="false"/>
-                <w:sz w:val="15"/>
-                <w:szCs w:val="15"/>
-              </w:rPr>
-              <w:t xml:space="preserve">0</w:t>
-            </w:r>
-          </w:p>
+          <w:p/>
         </w:tc>
       </w:tr>
       <w:tr>
@@ -11301,7 +11279,7 @@
                 <w:sz w:val="15"/>
                 <w:szCs w:val="15"/>
               </w:rPr>
-              <w:t xml:space="preserve">identity match status</w:t>
+              <w:t xml:space="preserve">all 47 share/coverage variables within [0,1]</w:t>
             </w:r>
           </w:p>
         </w:tc>
@@ -11330,7 +11308,7 @@
                 <w:sz w:val="15"/>
                 <w:szCs w:val="15"/>
               </w:rPr>
-              <w:t xml:space="preserve">INFO</w:t>
+              <w:t xml:space="preserve">PASS</w:t>
             </w:r>
           </w:p>
         </w:tc>
@@ -11359,7 +11337,7 @@
                 <w:sz w:val="15"/>
                 <w:szCs w:val="15"/>
               </w:rPr>
-              <w:t xml:space="preserve">{'matched_exact': 164808, 'unmatched': 24}</w:t>
+              <w:t xml:space="preserve">0</w:t>
             </w:r>
           </w:p>
         </w:tc>
@@ -11419,7 +11397,7 @@
                 <w:sz w:val="15"/>
                 <w:szCs w:val="15"/>
               </w:rPr>
-              <w:t xml:space="preserve">E</w:t>
+              <w:t xml:space="preserve">D</w:t>
             </w:r>
           </w:p>
         </w:tc>
@@ -11448,7 +11426,7 @@
                 <w:sz w:val="15"/>
                 <w:szCs w:val="15"/>
               </w:rPr>
-              <w:t xml:space="preserve">primary key unique</w:t>
+              <w:t xml:space="preserve">lower bound &lt;= upper bound (14 pairs)</w:t>
             </w:r>
           </w:p>
         </w:tc>
@@ -11506,7 +11484,7 @@
                 <w:sz w:val="15"/>
                 <w:szCs w:val="15"/>
               </w:rPr>
-              <w:t xml:space="preserve">33278</w:t>
+              <w:t xml:space="preserve">0</w:t>
             </w:r>
           </w:p>
         </w:tc>
@@ -11566,7 +11544,7 @@
                 <w:sz w:val="15"/>
                 <w:szCs w:val="15"/>
               </w:rPr>
-              <w:t xml:space="preserve">E</w:t>
+              <w:t xml:space="preserve">D</w:t>
             </w:r>
           </w:p>
         </w:tc>
@@ -11595,7 +11573,7 @@
                 <w:sz w:val="15"/>
                 <w:szCs w:val="15"/>
               </w:rPr>
-              <w:t xml:space="preserve">strict CEO sample: exactly one CEO per firm-year</w:t>
+              <w:t xml:space="preserve">identity match status</w:t>
             </w:r>
           </w:p>
         </w:tc>
@@ -11624,7 +11602,7 @@
                 <w:sz w:val="15"/>
                 <w:szCs w:val="15"/>
               </w:rPr>
-              <w:t xml:space="preserve">PASS</w:t>
+              <w:t xml:space="preserve">INFO</w:t>
             </w:r>
           </w:p>
         </w:tc>
@@ -11653,7 +11631,7 @@
                 <w:sz w:val="15"/>
                 <w:szCs w:val="15"/>
               </w:rPr>
-              <w:t xml:space="preserve">32231</w:t>
+              <w:t xml:space="preserve">{'matched_exact': 164808, 'unmatched': 24}</w:t>
             </w:r>
           </w:p>
         </w:tc>
@@ -11742,7 +11720,7 @@
                 <w:sz w:val="15"/>
                 <w:szCs w:val="15"/>
               </w:rPr>
-              <w:t xml:space="preserve">every CEO row exists as an executive-year or has no grants</w:t>
+              <w:t xml:space="preserve">primary key unique</w:t>
             </w:r>
           </w:p>
         </w:tc>
@@ -11791,7 +11769,18 @@
               <w:right w:type="dxa" w:w="80"/>
             </w:tcMar>
           </w:tcPr>
-          <w:p/>
+          <w:p>
+            <w:r>
+              <w:rPr>
+                <w:rFonts w:ascii="Calibri" w:cs="Calibri" w:eastAsia="Microsoft YaHei" w:hAnsi="Calibri"/>
+                <w:b w:val="false"/>
+                <w:bCs w:val="false"/>
+                <w:sz w:val="15"/>
+                <w:szCs w:val="15"/>
+              </w:rPr>
+              <w:t xml:space="preserve">33278</w:t>
+            </w:r>
+          </w:p>
         </w:tc>
       </w:tr>
       <w:tr>
@@ -11878,7 +11867,7 @@
                 <w:sz w:val="15"/>
                 <w:szCs w:val="15"/>
               </w:rPr>
-              <w:t xml:space="preserve">CEO identification status</w:t>
+              <w:t xml:space="preserve">strict CEO sample: exactly one CEO per firm-year</w:t>
             </w:r>
           </w:p>
         </w:tc>
@@ -11907,7 +11896,7 @@
                 <w:sz w:val="15"/>
                 <w:szCs w:val="15"/>
               </w:rPr>
-              <w:t xml:space="preserve">INFO</w:t>
+              <w:t xml:space="preserve">PASS</w:t>
             </w:r>
           </w:p>
         </w:tc>
@@ -11936,7 +11925,7 @@
                 <w:sz w:val="15"/>
                 <w:szCs w:val="15"/>
               </w:rPr>
-              <w:t xml:space="preserve">{'unique_current_ceo_flag': 32231, 'multiple_current_ceo_flags': 1033, 'rolecode_fallback_unique': 14}</w:t>
+              <w:t xml:space="preserve">32231</w:t>
             </w:r>
           </w:p>
         </w:tc>
@@ -12025,7 +12014,7 @@
                 <w:sz w:val="15"/>
                 <w:szCs w:val="15"/>
               </w:rPr>
-              <w:t xml:space="preserve">CEOs without grants have count variables = 0</w:t>
+              <w:t xml:space="preserve">every CEO row exists as an executive-year or has no grants</w:t>
             </w:r>
           </w:p>
         </w:tc>
@@ -12161,7 +12150,7 @@
                 <w:sz w:val="15"/>
                 <w:szCs w:val="15"/>
               </w:rPr>
-              <w:t xml:space="preserve">all 47 share/coverage variables within [0,1]</w:t>
+              <w:t xml:space="preserve">CEO identification status</w:t>
             </w:r>
           </w:p>
         </w:tc>
@@ -12190,7 +12179,7 @@
                 <w:sz w:val="15"/>
                 <w:szCs w:val="15"/>
               </w:rPr>
-              <w:t xml:space="preserve">PASS</w:t>
+              <w:t xml:space="preserve">INFO</w:t>
             </w:r>
           </w:p>
         </w:tc>
@@ -12219,7 +12208,7 @@
                 <w:sz w:val="15"/>
                 <w:szCs w:val="15"/>
               </w:rPr>
-              <w:t xml:space="preserve">0</w:t>
+              <w:t xml:space="preserve">{'unique_current_ceo_flag': 32231, 'multiple_current_ceo_flags': 1033, 'rolecode_fallback_unique': 14}</w:t>
             </w:r>
           </w:p>
         </w:tc>
@@ -12308,7 +12297,7 @@
                 <w:sz w:val="15"/>
                 <w:szCs w:val="15"/>
               </w:rPr>
-              <w:t xml:space="preserve">lower bound &lt;= upper bound (14 pairs)</w:t>
+              <w:t xml:space="preserve">CEOs without grants have count variables = 0</w:t>
             </w:r>
           </w:p>
         </w:tc>
@@ -12357,18 +12346,7 @@
               <w:right w:type="dxa" w:w="80"/>
             </w:tcMar>
           </w:tcPr>
-          <w:p>
-            <w:r>
-              <w:rPr>
-                <w:rFonts w:ascii="Calibri" w:cs="Calibri" w:eastAsia="Microsoft YaHei" w:hAnsi="Calibri"/>
-                <w:b w:val="false"/>
-                <w:bCs w:val="false"/>
-                <w:sz w:val="15"/>
-                <w:szCs w:val="15"/>
-              </w:rPr>
-              <w:t xml:space="preserve">0</w:t>
-            </w:r>
-          </w:p>
+          <w:p/>
         </w:tc>
       </w:tr>
       <w:tr>
@@ -12426,7 +12404,7 @@
                 <w:sz w:val="15"/>
                 <w:szCs w:val="15"/>
               </w:rPr>
-              <w:t xml:space="preserve">F</w:t>
+              <w:t xml:space="preserve">E</w:t>
             </w:r>
           </w:p>
         </w:tc>
@@ -12455,7 +12433,7 @@
                 <w:sz w:val="15"/>
                 <w:szCs w:val="15"/>
               </w:rPr>
-              <w:t xml:space="preserve">primary key (cik, fiscalyear) unique</w:t>
+              <w:t xml:space="preserve">all 47 share/coverage variables within [0,1]</w:t>
             </w:r>
           </w:p>
         </w:tc>
@@ -12513,7 +12491,7 @@
                 <w:sz w:val="15"/>
                 <w:szCs w:val="15"/>
               </w:rPr>
-              <w:t xml:space="preserve">33328</w:t>
+              <w:t xml:space="preserve">0</w:t>
             </w:r>
           </w:p>
         </w:tc>
@@ -12573,7 +12551,7 @@
                 <w:sz w:val="15"/>
                 <w:szCs w:val="15"/>
               </w:rPr>
-              <w:t xml:space="preserve">F</w:t>
+              <w:t xml:space="preserve">E</w:t>
             </w:r>
           </w:p>
         </w:tc>
@@ -12602,7 +12580,7 @@
                 <w:sz w:val="15"/>
                 <w:szCs w:val="15"/>
               </w:rPr>
-              <w:t xml:space="preserve">sum firm_n_grants = grants</w:t>
+              <w:t xml:space="preserve">lower bound &lt;= upper bound (14 pairs)</w:t>
             </w:r>
           </w:p>
         </w:tc>
@@ -12651,7 +12629,18 @@
               <w:right w:type="dxa" w:w="80"/>
             </w:tcMar>
           </w:tcPr>
-          <w:p/>
+          <w:p>
+            <w:r>
+              <w:rPr>
+                <w:rFonts w:ascii="Calibri" w:cs="Calibri" w:eastAsia="Microsoft YaHei" w:hAnsi="Calibri"/>
+                <w:b w:val="false"/>
+                <w:bCs w:val="false"/>
+                <w:sz w:val="15"/>
+                <w:szCs w:val="15"/>
+              </w:rPr>
+              <w:t xml:space="preserve">0</w:t>
+            </w:r>
+          </w:p>
         </w:tc>
       </w:tr>
       <w:tr>
@@ -12738,7 +12727,7 @@
                 <w:sz w:val="15"/>
                 <w:szCs w:val="15"/>
               </w:rPr>
-              <w:t xml:space="preserve">firm counts = sum over executive-years (grants, perf, ESG, unknown)</w:t>
+              <w:t xml:space="preserve">primary key (cik, fiscalyear) unique</w:t>
             </w:r>
           </w:p>
         </w:tc>
@@ -12787,7 +12776,18 @@
               <w:right w:type="dxa" w:w="80"/>
             </w:tcMar>
           </w:tcPr>
-          <w:p/>
+          <w:p>
+            <w:r>
+              <w:rPr>
+                <w:rFonts w:ascii="Calibri" w:cs="Calibri" w:eastAsia="Microsoft YaHei" w:hAnsi="Calibri"/>
+                <w:b w:val="false"/>
+                <w:bCs w:val="false"/>
+                <w:sz w:val="15"/>
+                <w:szCs w:val="15"/>
+              </w:rPr>
+              <w:t xml:space="preserve">33328</w:t>
+            </w:r>
+          </w:p>
         </w:tc>
       </w:tr>
       <w:tr>
@@ -12874,7 +12874,7 @@
                 <w:sz w:val="15"/>
                 <w:szCs w:val="15"/>
               </w:rPr>
-              <w:t xml:space="preserve">firm adoption = aggregation of executive adoption</w:t>
+              <w:t xml:space="preserve">sum firm_n_grants = grants</w:t>
             </w:r>
           </w:p>
         </w:tc>
@@ -13010,7 +13010,7 @@
                 <w:sz w:val="15"/>
                 <w:szCs w:val="15"/>
               </w:rPr>
-              <w:t xml:space="preserve">firm-years without grants have missing (not 0) ESG measures</w:t>
+              <w:t xml:space="preserve">firm counts = sum over executive-years (grants, perf, ESG, unknown)</w:t>
             </w:r>
           </w:p>
         </w:tc>
@@ -13059,18 +13059,7 @@
               <w:right w:type="dxa" w:w="80"/>
             </w:tcMar>
           </w:tcPr>
-          <w:p>
-            <w:r>
-              <w:rPr>
-                <w:rFonts w:ascii="Calibri" w:cs="Calibri" w:eastAsia="Microsoft YaHei" w:hAnsi="Calibri"/>
-                <w:b w:val="false"/>
-                <w:bCs w:val="false"/>
-                <w:sz w:val="15"/>
-                <w:szCs w:val="15"/>
-              </w:rPr>
-              <w:t xml:space="preserve">776</w:t>
-            </w:r>
-          </w:p>
+          <w:p/>
         </w:tc>
       </w:tr>
       <w:tr>
@@ -13157,7 +13146,7 @@
                 <w:sz w:val="15"/>
                 <w:szCs w:val="15"/>
               </w:rPr>
-              <w:t xml:space="preserve">firm-years without grants have count variables = 0 (not missing)</w:t>
+              <w:t xml:space="preserve">firm adoption = aggregation of executive adoption</w:t>
             </w:r>
           </w:p>
         </w:tc>
@@ -13293,7 +13282,7 @@
                 <w:sz w:val="15"/>
                 <w:szCs w:val="15"/>
               </w:rPr>
-              <w:t xml:space="preserve">pillar E adoption = 1 implies Strict perf adoption = 1</w:t>
+              <w:t xml:space="preserve">firm-years without grants have missing (not 0) ESG measures</w:t>
             </w:r>
           </w:p>
         </w:tc>
@@ -13342,7 +13331,18 @@
               <w:right w:type="dxa" w:w="80"/>
             </w:tcMar>
           </w:tcPr>
-          <w:p/>
+          <w:p>
+            <w:r>
+              <w:rPr>
+                <w:rFonts w:ascii="Calibri" w:cs="Calibri" w:eastAsia="Microsoft YaHei" w:hAnsi="Calibri"/>
+                <w:b w:val="false"/>
+                <w:bCs w:val="false"/>
+                <w:sz w:val="15"/>
+                <w:szCs w:val="15"/>
+              </w:rPr>
+              <w:t xml:space="preserve">776</w:t>
+            </w:r>
+          </w:p>
         </w:tc>
       </w:tr>
       <w:tr>
@@ -13429,7 +13429,7 @@
                 <w:sz w:val="15"/>
                 <w:szCs w:val="15"/>
               </w:rPr>
-              <w:t xml:space="preserve">pillar S adoption = 1 implies Strict perf adoption = 1</w:t>
+              <w:t xml:space="preserve">firm-years without grants have count variables = 0 (not missing)</w:t>
             </w:r>
           </w:p>
         </w:tc>
@@ -13565,7 +13565,7 @@
                 <w:sz w:val="15"/>
                 <w:szCs w:val="15"/>
               </w:rPr>
-              <w:t xml:space="preserve">pillar G adoption = 1 implies Strict perf adoption = 1</w:t>
+              <w:t xml:space="preserve">pillar E adoption = 1 implies Strict perf adoption = 1</w:t>
             </w:r>
           </w:p>
         </w:tc>
@@ -13701,7 +13701,7 @@
                 <w:sz w:val="15"/>
                 <w:szCs w:val="15"/>
               </w:rPr>
-              <w:t xml:space="preserve">firm E adoption re-derived from grants (pillar-specific zero rule)</w:t>
+              <w:t xml:space="preserve">pillar S adoption = 1 implies Strict perf adoption = 1</w:t>
             </w:r>
           </w:p>
         </w:tc>
@@ -13837,7 +13837,7 @@
                 <w:sz w:val="15"/>
                 <w:szCs w:val="15"/>
               </w:rPr>
-              <w:t xml:space="preserve">firm E perf-grant share lower bound re-derived from grants</w:t>
+              <w:t xml:space="preserve">pillar G adoption = 1 implies Strict perf adoption = 1</w:t>
             </w:r>
           </w:p>
         </w:tc>
@@ -13973,7 +13973,7 @@
                 <w:sz w:val="15"/>
                 <w:szCs w:val="15"/>
               </w:rPr>
-              <w:t xml:space="preserve">firm S adoption re-derived from grants (pillar-specific zero rule)</w:t>
+              <w:t xml:space="preserve">firm E adoption re-derived from grants (pillar-specific zero rule)</w:t>
             </w:r>
           </w:p>
         </w:tc>
@@ -14109,7 +14109,7 @@
                 <w:sz w:val="15"/>
                 <w:szCs w:val="15"/>
               </w:rPr>
-              <w:t xml:space="preserve">firm S perf-grant share lower bound re-derived from grants</w:t>
+              <w:t xml:space="preserve">firm E perf-grant share lower bound re-derived from grants</w:t>
             </w:r>
           </w:p>
         </w:tc>
@@ -14245,7 +14245,7 @@
                 <w:sz w:val="15"/>
                 <w:szCs w:val="15"/>
               </w:rPr>
-              <w:t xml:space="preserve">firm G adoption re-derived from grants (pillar-specific zero rule)</w:t>
+              <w:t xml:space="preserve">firm S adoption re-derived from grants (pillar-specific zero rule)</w:t>
             </w:r>
           </w:p>
         </w:tc>
@@ -14381,7 +14381,7 @@
                 <w:sz w:val="15"/>
                 <w:szCs w:val="15"/>
               </w:rPr>
-              <w:t xml:space="preserve">firm G perf-grant share lower bound re-derived from grants</w:t>
+              <w:t xml:space="preserve">firm S perf-grant share lower bound re-derived from grants</w:t>
             </w:r>
           </w:p>
         </w:tc>
@@ -14517,7 +14517,7 @@
                 <w:sz w:val="15"/>
                 <w:szCs w:val="15"/>
               </w:rPr>
-              <w:t xml:space="preserve">S adoption is not identical to Strict adoption (guards against a pillar/strict name collision)</w:t>
+              <w:t xml:space="preserve">firm G adoption re-derived from grants (pillar-specific zero rule)</w:t>
             </w:r>
           </w:p>
         </w:tc>
@@ -14653,7 +14653,7 @@
                 <w:sz w:val="15"/>
                 <w:szCs w:val="15"/>
               </w:rPr>
-              <w:t xml:space="preserve">all 47 share/coverage variables within [0,1]</w:t>
+              <w:t xml:space="preserve">firm G perf-grant share lower bound re-derived from grants</w:t>
             </w:r>
           </w:p>
         </w:tc>
@@ -14702,18 +14702,7 @@
               <w:right w:type="dxa" w:w="80"/>
             </w:tcMar>
           </w:tcPr>
-          <w:p>
-            <w:r>
-              <w:rPr>
-                <w:rFonts w:ascii="Calibri" w:cs="Calibri" w:eastAsia="Microsoft YaHei" w:hAnsi="Calibri"/>
-                <w:b w:val="false"/>
-                <w:bCs w:val="false"/>
-                <w:sz w:val="15"/>
-                <w:szCs w:val="15"/>
-              </w:rPr>
-              <w:t xml:space="preserve">0</w:t>
-            </w:r>
-          </w:p>
+          <w:p/>
         </w:tc>
       </w:tr>
       <w:tr>
@@ -14800,7 +14789,7 @@
                 <w:sz w:val="15"/>
                 <w:szCs w:val="15"/>
               </w:rPr>
-              <w:t xml:space="preserve">lower bound &lt;= upper bound (14 pairs)</w:t>
+              <w:t xml:space="preserve">S adoption is not identical to Strict adoption (guards against a pillar/strict name collision)</w:t>
             </w:r>
           </w:p>
         </w:tc>
@@ -14849,18 +14838,7 @@
               <w:right w:type="dxa" w:w="80"/>
             </w:tcMar>
           </w:tcPr>
-          <w:p>
-            <w:r>
-              <w:rPr>
-                <w:rFonts w:ascii="Calibri" w:cs="Calibri" w:eastAsia="Microsoft YaHei" w:hAnsi="Calibri"/>
-                <w:b w:val="false"/>
-                <w:bCs w:val="false"/>
-                <w:sz w:val="15"/>
-                <w:szCs w:val="15"/>
-              </w:rPr>
-              <w:t xml:space="preserve">0</w:t>
-            </w:r>
-          </w:p>
+          <w:p/>
         </w:tc>
       </w:tr>
       <w:tr>
@@ -14918,7 +14896,7 @@
                 <w:sz w:val="15"/>
                 <w:szCs w:val="15"/>
               </w:rPr>
-              <w:t xml:space="preserve">G</w:t>
+              <w:t xml:space="preserve">F</w:t>
             </w:r>
           </w:p>
         </w:tc>
@@ -14947,7 +14925,7 @@
                 <w:sz w:val="15"/>
                 <w:szCs w:val="15"/>
               </w:rPr>
-              <w:t xml:space="preserve">primary key (cik, fiscalyear) unique</w:t>
+              <w:t xml:space="preserve">all 47 share/coverage variables within [0,1]</w:t>
             </w:r>
           </w:p>
         </w:tc>
@@ -15005,7 +14983,7 @@
                 <w:sz w:val="15"/>
                 <w:szCs w:val="15"/>
               </w:rPr>
-              <w:t xml:space="preserve">31944</w:t>
+              <w:t xml:space="preserve">0</w:t>
             </w:r>
           </w:p>
         </w:tc>
@@ -15065,7 +15043,7 @@
                 <w:sz w:val="15"/>
                 <w:szCs w:val="15"/>
               </w:rPr>
-              <w:t xml:space="preserve">G</w:t>
+              <w:t xml:space="preserve">F</w:t>
             </w:r>
           </w:p>
         </w:tc>
@@ -15094,7 +15072,7 @@
                 <w:sz w:val="15"/>
                 <w:szCs w:val="15"/>
               </w:rPr>
-              <w:t xml:space="preserve">non-CEO grants &lt;= firm grants</w:t>
+              <w:t xml:space="preserve">lower bound &lt;= upper bound (14 pairs)</w:t>
             </w:r>
           </w:p>
         </w:tc>
@@ -15143,7 +15121,18 @@
               <w:right w:type="dxa" w:w="80"/>
             </w:tcMar>
           </w:tcPr>
-          <w:p/>
+          <w:p>
+            <w:r>
+              <w:rPr>
+                <w:rFonts w:ascii="Calibri" w:cs="Calibri" w:eastAsia="Microsoft YaHei" w:hAnsi="Calibri"/>
+                <w:b w:val="false"/>
+                <w:bCs w:val="false"/>
+                <w:sz w:val="15"/>
+                <w:szCs w:val="15"/>
+              </w:rPr>
+              <w:t xml:space="preserve">0</w:t>
+            </w:r>
+          </w:p>
         </w:tc>
       </w:tr>
       <w:tr>
@@ -15230,7 +15219,7 @@
                 <w:sz w:val="15"/>
                 <w:szCs w:val="15"/>
               </w:rPr>
-              <w:t xml:space="preserve">all 47 share/coverage variables within [0,1]</w:t>
+              <w:t xml:space="preserve">primary key (cik, fiscalyear) unique</w:t>
             </w:r>
           </w:p>
         </w:tc>
@@ -15288,7 +15277,7 @@
                 <w:sz w:val="15"/>
                 <w:szCs w:val="15"/>
               </w:rPr>
-              <w:t xml:space="preserve">0</w:t>
+              <w:t xml:space="preserve">31944</w:t>
             </w:r>
           </w:p>
         </w:tc>
@@ -15377,7 +15366,7 @@
                 <w:sz w:val="15"/>
                 <w:szCs w:val="15"/>
               </w:rPr>
-              <w:t xml:space="preserve">lower bound &lt;= upper bound (14 pairs)</w:t>
+              <w:t xml:space="preserve">non-CEO grants &lt;= firm grants</w:t>
             </w:r>
           </w:p>
         </w:tc>
@@ -15426,18 +15415,7 @@
               <w:right w:type="dxa" w:w="80"/>
             </w:tcMar>
           </w:tcPr>
-          <w:p>
-            <w:r>
-              <w:rPr>
-                <w:rFonts w:ascii="Calibri" w:cs="Calibri" w:eastAsia="Microsoft YaHei" w:hAnsi="Calibri"/>
-                <w:b w:val="false"/>
-                <w:bCs w:val="false"/>
-                <w:sz w:val="15"/>
-                <w:szCs w:val="15"/>
-              </w:rPr>
-              <w:t xml:space="preserve">0</w:t>
-            </w:r>
-          </w:p>
+          <w:p/>
         </w:tc>
       </w:tr>
       <w:tr>
@@ -15495,7 +15473,7 @@
                 <w:sz w:val="15"/>
                 <w:szCs w:val="15"/>
               </w:rPr>
-              <w:t xml:space="preserve">audit</w:t>
+              <w:t xml:space="preserve">G</w:t>
             </w:r>
           </w:p>
         </w:tc>
@@ -15524,7 +15502,7 @@
                 <w:sz w:val="15"/>
                 <w:szCs w:val="15"/>
               </w:rPr>
-              <w:t xml:space="preserve">audit_goal_grants_missing_in_grant_table.csv</w:t>
+              <w:t xml:space="preserve">all 47 share/coverage variables within [0,1]</w:t>
             </w:r>
           </w:p>
         </w:tc>
@@ -15553,7 +15531,7 @@
                 <w:sz w:val="15"/>
                 <w:szCs w:val="15"/>
               </w:rPr>
-              <w:t xml:space="preserve">INFO</w:t>
+              <w:t xml:space="preserve">PASS</w:t>
             </w:r>
           </w:p>
         </w:tc>
@@ -15582,7 +15560,7 @@
                 <w:sz w:val="15"/>
                 <w:szCs w:val="15"/>
               </w:rPr>
-              <w:t xml:space="preserve">3</w:t>
+              <w:t xml:space="preserve">0</w:t>
             </w:r>
           </w:p>
         </w:tc>
@@ -15642,7 +15620,7 @@
                 <w:sz w:val="15"/>
                 <w:szCs w:val="15"/>
               </w:rPr>
-              <w:t xml:space="preserve">audit</w:t>
+              <w:t xml:space="preserve">G</w:t>
             </w:r>
           </w:p>
         </w:tc>
@@ -15671,7 +15649,7 @@
                 <w:sz w:val="15"/>
                 <w:szCs w:val="15"/>
               </w:rPr>
-              <w:t xml:space="preserve">audit_grants_unmatched_participant.csv</w:t>
+              <w:t xml:space="preserve">lower bound &lt;= upper bound (14 pairs)</w:t>
             </w:r>
           </w:p>
         </w:tc>
@@ -15700,7 +15678,7 @@
                 <w:sz w:val="15"/>
                 <w:szCs w:val="15"/>
               </w:rPr>
-              <w:t xml:space="preserve">INFO</w:t>
+              <w:t xml:space="preserve">PASS</w:t>
             </w:r>
           </w:p>
         </w:tc>
@@ -15729,7 +15707,7 @@
                 <w:sz w:val="15"/>
                 <w:szCs w:val="15"/>
               </w:rPr>
-              <w:t xml:space="preserve">117</w:t>
+              <w:t xml:space="preserve">0</w:t>
             </w:r>
           </w:p>
         </w:tc>
@@ -15818,7 +15796,7 @@
                 <w:sz w:val="15"/>
                 <w:szCs w:val="15"/>
               </w:rPr>
-              <w:t xml:space="preserve">audit_ceo_exceptions.csv</w:t>
+              <w:t xml:space="preserve">audit_goal_grants_missing_in_grant_table.csv</w:t>
             </w:r>
           </w:p>
         </w:tc>
@@ -15876,7 +15854,7 @@
                 <w:sz w:val="15"/>
                 <w:szCs w:val="15"/>
               </w:rPr>
-              <w:t xml:space="preserve">1960</w:t>
+              <w:t xml:space="preserve">3</w:t>
             </w:r>
           </w:p>
         </w:tc>
@@ -15908,6 +15886,300 @@
                 <w:szCs w:val="15"/>
               </w:rPr>
               <w:t xml:space="preserve">Q093</w:t>
+            </w:r>
+          </w:p>
+        </w:tc>
+        <w:tc>
+          <w:tcPr>
+            <w:tcW w:type="dxa" w:w="702"/>
+            <w:tcBorders>
+              <w:top w:val="single" w:color="BFBFBF" w:sz="4"/>
+              <w:left w:val="single" w:color="BFBFBF" w:sz="4"/>
+              <w:bottom w:val="single" w:color="BFBFBF" w:sz="4"/>
+              <w:right w:val="single" w:color="BFBFBF" w:sz="4"/>
+            </w:tcBorders>
+            <w:tcMar>
+              <w:top w:type="dxa" w:w="40"/>
+              <w:left w:type="dxa" w:w="80"/>
+              <w:bottom w:type="dxa" w:w="40"/>
+              <w:right w:type="dxa" w:w="80"/>
+            </w:tcMar>
+          </w:tcPr>
+          <w:p>
+            <w:r>
+              <w:rPr>
+                <w:rFonts w:ascii="Calibri" w:cs="Calibri" w:eastAsia="Microsoft YaHei" w:hAnsi="Calibri"/>
+                <w:b w:val="false"/>
+                <w:bCs w:val="false"/>
+                <w:sz w:val="15"/>
+                <w:szCs w:val="15"/>
+              </w:rPr>
+              <w:t xml:space="preserve">audit</w:t>
+            </w:r>
+          </w:p>
+        </w:tc>
+        <w:tc>
+          <w:tcPr>
+            <w:tcW w:type="dxa" w:w="4718"/>
+            <w:tcBorders>
+              <w:top w:val="single" w:color="BFBFBF" w:sz="4"/>
+              <w:left w:val="single" w:color="BFBFBF" w:sz="4"/>
+              <w:bottom w:val="single" w:color="BFBFBF" w:sz="4"/>
+              <w:right w:val="single" w:color="BFBFBF" w:sz="4"/>
+            </w:tcBorders>
+            <w:tcMar>
+              <w:top w:type="dxa" w:w="40"/>
+              <w:left w:type="dxa" w:w="80"/>
+              <w:bottom w:type="dxa" w:w="40"/>
+              <w:right w:type="dxa" w:w="80"/>
+            </w:tcMar>
+          </w:tcPr>
+          <w:p>
+            <w:r>
+              <w:rPr>
+                <w:rFonts w:ascii="Calibri" w:cs="Calibri" w:eastAsia="Microsoft YaHei" w:hAnsi="Calibri"/>
+                <w:b w:val="false"/>
+                <w:bCs w:val="false"/>
+                <w:sz w:val="15"/>
+                <w:szCs w:val="15"/>
+              </w:rPr>
+              <w:t xml:space="preserve">audit_grants_unmatched_participant.csv</w:t>
+            </w:r>
+          </w:p>
+        </w:tc>
+        <w:tc>
+          <w:tcPr>
+            <w:tcW w:type="dxa" w:w="803"/>
+            <w:tcBorders>
+              <w:top w:val="single" w:color="BFBFBF" w:sz="4"/>
+              <w:left w:val="single" w:color="BFBFBF" w:sz="4"/>
+              <w:bottom w:val="single" w:color="BFBFBF" w:sz="4"/>
+              <w:right w:val="single" w:color="BFBFBF" w:sz="4"/>
+            </w:tcBorders>
+            <w:tcMar>
+              <w:top w:type="dxa" w:w="40"/>
+              <w:left w:type="dxa" w:w="80"/>
+              <w:bottom w:type="dxa" w:w="40"/>
+              <w:right w:type="dxa" w:w="80"/>
+            </w:tcMar>
+          </w:tcPr>
+          <w:p>
+            <w:r>
+              <w:rPr>
+                <w:rFonts w:ascii="Calibri" w:cs="Calibri" w:eastAsia="Microsoft YaHei" w:hAnsi="Calibri"/>
+                <w:b w:val="false"/>
+                <w:bCs w:val="false"/>
+                <w:sz w:val="15"/>
+                <w:szCs w:val="15"/>
+              </w:rPr>
+              <w:t xml:space="preserve">INFO</w:t>
+            </w:r>
+          </w:p>
+        </w:tc>
+        <w:tc>
+          <w:tcPr>
+            <w:tcW w:type="dxa" w:w="2612"/>
+            <w:tcBorders>
+              <w:top w:val="single" w:color="BFBFBF" w:sz="4"/>
+              <w:left w:val="single" w:color="BFBFBF" w:sz="4"/>
+              <w:bottom w:val="single" w:color="BFBFBF" w:sz="4"/>
+              <w:right w:val="single" w:color="BFBFBF" w:sz="4"/>
+            </w:tcBorders>
+            <w:tcMar>
+              <w:top w:type="dxa" w:w="40"/>
+              <w:left w:type="dxa" w:w="80"/>
+              <w:bottom w:type="dxa" w:w="40"/>
+              <w:right w:type="dxa" w:w="80"/>
+            </w:tcMar>
+          </w:tcPr>
+          <w:p>
+            <w:r>
+              <w:rPr>
+                <w:rFonts w:ascii="Calibri" w:cs="Calibri" w:eastAsia="Microsoft YaHei" w:hAnsi="Calibri"/>
+                <w:b w:val="false"/>
+                <w:bCs w:val="false"/>
+                <w:sz w:val="15"/>
+                <w:szCs w:val="15"/>
+              </w:rPr>
+              <w:t xml:space="preserve">117</w:t>
+            </w:r>
+          </w:p>
+        </w:tc>
+      </w:tr>
+      <w:tr>
+        <w:tc>
+          <w:tcPr>
+            <w:tcW w:type="dxa" w:w="803"/>
+            <w:tcBorders>
+              <w:top w:val="single" w:color="BFBFBF" w:sz="4"/>
+              <w:left w:val="single" w:color="BFBFBF" w:sz="4"/>
+              <w:bottom w:val="single" w:color="BFBFBF" w:sz="4"/>
+              <w:right w:val="single" w:color="BFBFBF" w:sz="4"/>
+            </w:tcBorders>
+            <w:tcMar>
+              <w:top w:type="dxa" w:w="40"/>
+              <w:left w:type="dxa" w:w="80"/>
+              <w:bottom w:type="dxa" w:w="40"/>
+              <w:right w:type="dxa" w:w="80"/>
+            </w:tcMar>
+          </w:tcPr>
+          <w:p>
+            <w:r>
+              <w:rPr>
+                <w:rFonts w:ascii="Calibri" w:cs="Calibri" w:eastAsia="Microsoft YaHei" w:hAnsi="Calibri"/>
+                <w:b w:val="false"/>
+                <w:bCs w:val="false"/>
+                <w:sz w:val="15"/>
+                <w:szCs w:val="15"/>
+              </w:rPr>
+              <w:t xml:space="preserve">Q094</w:t>
+            </w:r>
+          </w:p>
+        </w:tc>
+        <w:tc>
+          <w:tcPr>
+            <w:tcW w:type="dxa" w:w="702"/>
+            <w:tcBorders>
+              <w:top w:val="single" w:color="BFBFBF" w:sz="4"/>
+              <w:left w:val="single" w:color="BFBFBF" w:sz="4"/>
+              <w:bottom w:val="single" w:color="BFBFBF" w:sz="4"/>
+              <w:right w:val="single" w:color="BFBFBF" w:sz="4"/>
+            </w:tcBorders>
+            <w:tcMar>
+              <w:top w:type="dxa" w:w="40"/>
+              <w:left w:type="dxa" w:w="80"/>
+              <w:bottom w:type="dxa" w:w="40"/>
+              <w:right w:type="dxa" w:w="80"/>
+            </w:tcMar>
+          </w:tcPr>
+          <w:p>
+            <w:r>
+              <w:rPr>
+                <w:rFonts w:ascii="Calibri" w:cs="Calibri" w:eastAsia="Microsoft YaHei" w:hAnsi="Calibri"/>
+                <w:b w:val="false"/>
+                <w:bCs w:val="false"/>
+                <w:sz w:val="15"/>
+                <w:szCs w:val="15"/>
+              </w:rPr>
+              <w:t xml:space="preserve">audit</w:t>
+            </w:r>
+          </w:p>
+        </w:tc>
+        <w:tc>
+          <w:tcPr>
+            <w:tcW w:type="dxa" w:w="4718"/>
+            <w:tcBorders>
+              <w:top w:val="single" w:color="BFBFBF" w:sz="4"/>
+              <w:left w:val="single" w:color="BFBFBF" w:sz="4"/>
+              <w:bottom w:val="single" w:color="BFBFBF" w:sz="4"/>
+              <w:right w:val="single" w:color="BFBFBF" w:sz="4"/>
+            </w:tcBorders>
+            <w:tcMar>
+              <w:top w:type="dxa" w:w="40"/>
+              <w:left w:type="dxa" w:w="80"/>
+              <w:bottom w:type="dxa" w:w="40"/>
+              <w:right w:type="dxa" w:w="80"/>
+            </w:tcMar>
+          </w:tcPr>
+          <w:p>
+            <w:r>
+              <w:rPr>
+                <w:rFonts w:ascii="Calibri" w:cs="Calibri" w:eastAsia="Microsoft YaHei" w:hAnsi="Calibri"/>
+                <w:b w:val="false"/>
+                <w:bCs w:val="false"/>
+                <w:sz w:val="15"/>
+                <w:szCs w:val="15"/>
+              </w:rPr>
+              <w:t xml:space="preserve">audit_ceo_exceptions.csv</w:t>
+            </w:r>
+          </w:p>
+        </w:tc>
+        <w:tc>
+          <w:tcPr>
+            <w:tcW w:type="dxa" w:w="803"/>
+            <w:tcBorders>
+              <w:top w:val="single" w:color="BFBFBF" w:sz="4"/>
+              <w:left w:val="single" w:color="BFBFBF" w:sz="4"/>
+              <w:bottom w:val="single" w:color="BFBFBF" w:sz="4"/>
+              <w:right w:val="single" w:color="BFBFBF" w:sz="4"/>
+            </w:tcBorders>
+            <w:tcMar>
+              <w:top w:type="dxa" w:w="40"/>
+              <w:left w:type="dxa" w:w="80"/>
+              <w:bottom w:type="dxa" w:w="40"/>
+              <w:right w:type="dxa" w:w="80"/>
+            </w:tcMar>
+          </w:tcPr>
+          <w:p>
+            <w:r>
+              <w:rPr>
+                <w:rFonts w:ascii="Calibri" w:cs="Calibri" w:eastAsia="Microsoft YaHei" w:hAnsi="Calibri"/>
+                <w:b w:val="false"/>
+                <w:bCs w:val="false"/>
+                <w:sz w:val="15"/>
+                <w:szCs w:val="15"/>
+              </w:rPr>
+              <w:t xml:space="preserve">INFO</w:t>
+            </w:r>
+          </w:p>
+        </w:tc>
+        <w:tc>
+          <w:tcPr>
+            <w:tcW w:type="dxa" w:w="2612"/>
+            <w:tcBorders>
+              <w:top w:val="single" w:color="BFBFBF" w:sz="4"/>
+              <w:left w:val="single" w:color="BFBFBF" w:sz="4"/>
+              <w:bottom w:val="single" w:color="BFBFBF" w:sz="4"/>
+              <w:right w:val="single" w:color="BFBFBF" w:sz="4"/>
+            </w:tcBorders>
+            <w:tcMar>
+              <w:top w:type="dxa" w:w="40"/>
+              <w:left w:type="dxa" w:w="80"/>
+              <w:bottom w:type="dxa" w:w="40"/>
+              <w:right w:type="dxa" w:w="80"/>
+            </w:tcMar>
+          </w:tcPr>
+          <w:p>
+            <w:r>
+              <w:rPr>
+                <w:rFonts w:ascii="Calibri" w:cs="Calibri" w:eastAsia="Microsoft YaHei" w:hAnsi="Calibri"/>
+                <w:b w:val="false"/>
+                <w:bCs w:val="false"/>
+                <w:sz w:val="15"/>
+                <w:szCs w:val="15"/>
+              </w:rPr>
+              <w:t xml:space="preserve">1960</w:t>
+            </w:r>
+          </w:p>
+        </w:tc>
+      </w:tr>
+      <w:tr>
+        <w:tc>
+          <w:tcPr>
+            <w:tcW w:type="dxa" w:w="803"/>
+            <w:tcBorders>
+              <w:top w:val="single" w:color="BFBFBF" w:sz="4"/>
+              <w:left w:val="single" w:color="BFBFBF" w:sz="4"/>
+              <w:bottom w:val="single" w:color="BFBFBF" w:sz="4"/>
+              <w:right w:val="single" w:color="BFBFBF" w:sz="4"/>
+            </w:tcBorders>
+            <w:tcMar>
+              <w:top w:type="dxa" w:w="40"/>
+              <w:left w:type="dxa" w:w="80"/>
+              <w:bottom w:type="dxa" w:w="40"/>
+              <w:right w:type="dxa" w:w="80"/>
+            </w:tcMar>
+          </w:tcPr>
+          <w:p>
+            <w:r>
+              <w:rPr>
+                <w:rFonts w:ascii="Calibri" w:cs="Calibri" w:eastAsia="Microsoft YaHei" w:hAnsi="Calibri"/>
+                <w:b w:val="false"/>
+                <w:bCs w:val="false"/>
+                <w:sz w:val="15"/>
+                <w:szCs w:val="15"/>
+              </w:rPr>
+              <w:t xml:space="preserve">Q095</w:t>
             </w:r>
           </w:p>
         </w:tc>
@@ -17430,7 +17702,7 @@
                 <w:sz w:val="15"/>
                 <w:szCs w:val="15"/>
               </w:rPr>
-              <w:t xml:space="preserve">Q047</w:t>
+              <w:t xml:space="preserve">Q049</w:t>
             </w:r>
           </w:p>
         </w:tc>
@@ -17577,7 +17849,7 @@
                 <w:sz w:val="15"/>
                 <w:szCs w:val="15"/>
               </w:rPr>
-              <w:t xml:space="preserve">Q050</w:t>
+              <w:t xml:space="preserve">Q052</w:t>
             </w:r>
           </w:p>
         </w:tc>
@@ -17724,7 +17996,7 @@
                 <w:sz w:val="15"/>
                 <w:szCs w:val="15"/>
               </w:rPr>
-              <w:t xml:space="preserve">Q060</w:t>
+              <w:t xml:space="preserve">Q062</w:t>
             </w:r>
           </w:p>
         </w:tc>
@@ -17871,7 +18143,7 @@
                 <w:sz w:val="15"/>
                 <w:szCs w:val="15"/>
               </w:rPr>
-              <w:t xml:space="preserve">Q064</w:t>
+              <w:t xml:space="preserve">Q066</w:t>
             </w:r>
           </w:p>
         </w:tc>
@@ -18018,7 +18290,7 @@
                 <w:sz w:val="15"/>
                 <w:szCs w:val="15"/>
               </w:rPr>
-              <w:t xml:space="preserve">Q090</w:t>
+              <w:t xml:space="preserve">Q092</w:t>
             </w:r>
           </w:p>
         </w:tc>
@@ -18165,7 +18437,7 @@
                 <w:sz w:val="15"/>
                 <w:szCs w:val="15"/>
               </w:rPr>
-              <w:t xml:space="preserve">Q091</w:t>
+              <w:t xml:space="preserve">Q093</w:t>
             </w:r>
           </w:p>
         </w:tc>
@@ -18312,7 +18584,7 @@
                 <w:sz w:val="15"/>
                 <w:szCs w:val="15"/>
               </w:rPr>
-              <w:t xml:space="preserve">Q092</w:t>
+              <w:t xml:space="preserve">Q094</w:t>
             </w:r>
           </w:p>
         </w:tc>
@@ -18459,7 +18731,7 @@
                 <w:sz w:val="15"/>
                 <w:szCs w:val="15"/>
               </w:rPr>
-              <w:t xml:space="preserve">Q093</w:t>
+              <w:t xml:space="preserve">Q095</w:t>
             </w:r>
           </w:p>
         </w:tc>
@@ -18621,7 +18893,7 @@
         <w:rPr>
           <w:rFonts w:ascii="Calibri" w:cs="Calibri" w:eastAsia="Microsoft YaHei" w:hAnsi="Calibri"/>
         </w:rPr>
-        <w:t xml:space="preserve">不可能取值设为缺失：负的 grantDateFV n/a 个，负的 vestHighGrant n/a 个。</w:t>
+        <w:t xml:space="preserve">不可能取值设为缺失：负的 grantDateFV 1 个，负的 vestHighGrant 18 个。</w:t>
       </w:r>
     </w:p>
     <w:p>

</xml_diff>